<commit_message>
-fixing line endings, lists were broken -removing old experience
</commit_message>
<xml_diff>
--- a/resume-1page.docx
+++ b/resume-1page.docx
@@ -22,7 +22,13 @@
         <w:br/>
       </w:r>
       <w:r>
-        <w:t xml:space="preserve">LinkedIn: https://www.linkedin.com/in/trystanhill • GitHub: https://github.com/teehill</w:t>
+        <w:t xml:space="preserve">LinkedIn: https://www.linkedin.com/in/trystanhill</w:t>
+      </w:r>
+      <w:r>
+        <w:br/>
+      </w:r>
+      <w:r>
+        <w:t xml:space="preserve">GitHub: https://github.com/teehill</w:t>
       </w:r>
     </w:p>
     <w:bookmarkStart w:id="9" w:name="summary"/>
@@ -90,47 +96,89 @@
         </w:rPr>
         <w:t xml:space="preserve">2016 – Present</w:t>
       </w:r>
-      <w:r>
-        <w:t xml:space="preserve"> </w:t>
-      </w:r>
-      <w:r>
-        <w:t xml:space="preserve">- Reduced cloud spend across hundreds of workload accounts through governance, automation, and cost-optimization initiatives.</w:t>
-      </w:r>
-      <w:r>
-        <w:br/>
-      </w:r>
-      <w:r>
-        <w:t xml:space="preserve">- Owned CDN Customer Portal infrastructure &amp; CI/CD; improved performance and reliability while lowering operational cost.</w:t>
-      </w:r>
-      <w:r>
-        <w:br/>
-      </w:r>
-      <w:r>
-        <w:t xml:space="preserve">- Automated migration of Customer Portal from bare metal to cloud, including IaC, deployment pipelines, and service hardening.</w:t>
-      </w:r>
-      <w:r>
-        <w:br/>
-      </w:r>
-      <w:r>
-        <w:t xml:space="preserve">- Led API Guild reviews, establishing org-wide API conventions and improving developer experience.</w:t>
-      </w:r>
-      <w:r>
-        <w:br/>
-      </w:r>
-      <w:r>
-        <w:t xml:space="preserve">- Deployed telemetry and monitoring that exposed critical performance bottlenecks, leading refactoring efforts to improving response times.</w:t>
-      </w:r>
-      <w:r>
-        <w:br/>
-      </w:r>
-      <w:r>
-        <w:t xml:space="preserve">- Delivered new CDN configuration products and migrated customers from legacy systems.</w:t>
-      </w:r>
-      <w:r>
-        <w:br/>
-      </w:r>
-      <w:r>
-        <w:t xml:space="preserve">- Earlier DevOps role: modernized monolithic systems, automated deployments, and improved environment parity.</w:t>
+    </w:p>
+    <w:p>
+      <w:pPr>
+        <w:pStyle w:val="Compact"/>
+        <w:numPr>
+          <w:ilvl w:val="0"/>
+          <w:numId w:val="1001"/>
+        </w:numPr>
+      </w:pPr>
+      <w:r>
+        <w:t xml:space="preserve">Reduced cloud spend across hundreds of workload accounts through governance, automation, and cost-optimization initiatives.</w:t>
+      </w:r>
+    </w:p>
+    <w:p>
+      <w:pPr>
+        <w:pStyle w:val="Compact"/>
+        <w:numPr>
+          <w:ilvl w:val="0"/>
+          <w:numId w:val="1001"/>
+        </w:numPr>
+      </w:pPr>
+      <w:r>
+        <w:t xml:space="preserve">Owned CDN Customer Portal infrastructure &amp; CI/CD; improved performance and reliability while lowering operational cost.</w:t>
+      </w:r>
+    </w:p>
+    <w:p>
+      <w:pPr>
+        <w:pStyle w:val="Compact"/>
+        <w:numPr>
+          <w:ilvl w:val="0"/>
+          <w:numId w:val="1001"/>
+        </w:numPr>
+      </w:pPr>
+      <w:r>
+        <w:t xml:space="preserve">Automated migration of Customer Portal from bare metal to cloud, including IaC, deployment pipelines, and service hardening.</w:t>
+      </w:r>
+    </w:p>
+    <w:p>
+      <w:pPr>
+        <w:pStyle w:val="Compact"/>
+        <w:numPr>
+          <w:ilvl w:val="0"/>
+          <w:numId w:val="1001"/>
+        </w:numPr>
+      </w:pPr>
+      <w:r>
+        <w:t xml:space="preserve">Led API Guild reviews, establishing org-wide API conventions and improving developer experience.</w:t>
+      </w:r>
+    </w:p>
+    <w:p>
+      <w:pPr>
+        <w:pStyle w:val="Compact"/>
+        <w:numPr>
+          <w:ilvl w:val="0"/>
+          <w:numId w:val="1001"/>
+        </w:numPr>
+      </w:pPr>
+      <w:r>
+        <w:t xml:space="preserve">Deployed telemetry and monitoring that exposed critical performance bottlenecks, leading refactoring efforts to improving response times.</w:t>
+      </w:r>
+    </w:p>
+    <w:p>
+      <w:pPr>
+        <w:pStyle w:val="Compact"/>
+        <w:numPr>
+          <w:ilvl w:val="0"/>
+          <w:numId w:val="1001"/>
+        </w:numPr>
+      </w:pPr>
+      <w:r>
+        <w:t xml:space="preserve">Delivered new CDN configuration products and migrated customers from legacy systems.</w:t>
+      </w:r>
+    </w:p>
+    <w:p>
+      <w:pPr>
+        <w:pStyle w:val="Compact"/>
+        <w:numPr>
+          <w:ilvl w:val="0"/>
+          <w:numId w:val="1001"/>
+        </w:numPr>
+      </w:pPr>
+      <w:r>
+        <w:t xml:space="preserve">Earlier DevOps role: modernized monolithic systems, automated deployments, and improved environment parity.</w:t>
       </w:r>
     </w:p>
     <w:bookmarkEnd w:id="11"/>
@@ -154,23 +202,41 @@
         </w:rPr>
         <w:t xml:space="preserve">2011 – 2016</w:t>
       </w:r>
-      <w:r>
-        <w:t xml:space="preserve"> </w:t>
-      </w:r>
-      <w:r>
-        <w:t xml:space="preserve">- Full-stack development in C#, ASP.NET, Hibernate, and JavaScript.</w:t>
-      </w:r>
-      <w:r>
-        <w:br/>
-      </w:r>
-      <w:r>
-        <w:t xml:space="preserve">- Built automation tools including large-scale outreach systems and internal operational scripts.</w:t>
-      </w:r>
-      <w:r>
-        <w:br/>
-      </w:r>
-      <w:r>
-        <w:t xml:space="preserve">- Supported mission-critical applications, including emergency response workflows.</w:t>
+    </w:p>
+    <w:p>
+      <w:pPr>
+        <w:pStyle w:val="Compact"/>
+        <w:numPr>
+          <w:ilvl w:val="0"/>
+          <w:numId w:val="1002"/>
+        </w:numPr>
+      </w:pPr>
+      <w:r>
+        <w:t xml:space="preserve">Full-stack development in C#, ASP.NET, Hibernate, and JavaScript.</w:t>
+      </w:r>
+    </w:p>
+    <w:p>
+      <w:pPr>
+        <w:pStyle w:val="Compact"/>
+        <w:numPr>
+          <w:ilvl w:val="0"/>
+          <w:numId w:val="1002"/>
+        </w:numPr>
+      </w:pPr>
+      <w:r>
+        <w:t xml:space="preserve">Built automation tools including large-scale outreach systems and internal operational scripts.</w:t>
+      </w:r>
+    </w:p>
+    <w:p>
+      <w:pPr>
+        <w:pStyle w:val="Compact"/>
+        <w:numPr>
+          <w:ilvl w:val="0"/>
+          <w:numId w:val="1002"/>
+        </w:numPr>
+      </w:pPr>
+      <w:r>
+        <w:t xml:space="preserve">Supported mission-critical applications, including emergency response workflows.</w:t>
       </w:r>
     </w:p>
     <w:bookmarkEnd w:id="12"/>
@@ -194,23 +260,41 @@
         </w:rPr>
         <w:t xml:space="preserve">2006 – 2011</w:t>
       </w:r>
-      <w:r>
-        <w:t xml:space="preserve"> </w:t>
-      </w:r>
-      <w:r>
-        <w:t xml:space="preserve">- Designed and maintained systems from Windows services to database-driven applications.</w:t>
-      </w:r>
-      <w:r>
-        <w:br/>
-      </w:r>
-      <w:r>
-        <w:t xml:space="preserve">- Led ASP.NET development across backend, data, and UI layers.</w:t>
-      </w:r>
-      <w:r>
-        <w:br/>
-      </w:r>
-      <w:r>
-        <w:t xml:space="preserve">- Maintained internal infrastructure (SVN, Linux servers).</w:t>
+    </w:p>
+    <w:p>
+      <w:pPr>
+        <w:pStyle w:val="Compact"/>
+        <w:numPr>
+          <w:ilvl w:val="0"/>
+          <w:numId w:val="1003"/>
+        </w:numPr>
+      </w:pPr>
+      <w:r>
+        <w:t xml:space="preserve">Designed and maintained systems from Windows services to database-driven applications.</w:t>
+      </w:r>
+    </w:p>
+    <w:p>
+      <w:pPr>
+        <w:pStyle w:val="Compact"/>
+        <w:numPr>
+          <w:ilvl w:val="0"/>
+          <w:numId w:val="1003"/>
+        </w:numPr>
+      </w:pPr>
+      <w:r>
+        <w:t xml:space="preserve">Led ASP.NET development across backend, data, and UI layers.</w:t>
+      </w:r>
+    </w:p>
+    <w:p>
+      <w:pPr>
+        <w:pStyle w:val="Compact"/>
+        <w:numPr>
+          <w:ilvl w:val="0"/>
+          <w:numId w:val="1003"/>
+        </w:numPr>
+      </w:pPr>
+      <w:r>
+        <w:t xml:space="preserve">Maintained internal infrastructure (SVN, Linux servers).</w:t>
       </w:r>
     </w:p>
     <w:bookmarkEnd w:id="13"/>
@@ -229,11 +313,13 @@
         <w:pStyle w:val="FirstParagraph"/>
       </w:pPr>
       <w:r>
-        <w:t xml:space="preserve">Bachelor of Computing — University of Western Sydney</w:t>
-      </w:r>
-      <w:r>
-        <w:br/>
-      </w:r>
+        <w:t xml:space="preserve">Bachelor of Computing — University of Western Sydney (2005)</w:t>
+      </w:r>
+    </w:p>
+    <w:p>
+      <w:pPr>
+        <w:pStyle w:val="BodyText"/>
+      </w:pPr>
       <w:r>
         <w:t xml:space="preserve">Minor in Networking; study-abroad at CSU Long Beach on two academic scholarships.</w:t>
       </w:r>
@@ -253,7 +339,7 @@
         <w:pStyle w:val="Compact"/>
         <w:numPr>
           <w:ilvl w:val="0"/>
-          <w:numId w:val="1001"/>
+          <w:numId w:val="1004"/>
         </w:numPr>
       </w:pPr>
       <w:r>
@@ -280,16 +366,13 @@
           <w:t xml:space="preserve">Resilience Engineering with Polly</w:t>
         </w:r>
       </w:hyperlink>
-      <w:r>
-        <w:br/>
-      </w:r>
     </w:p>
     <w:p>
       <w:pPr>
         <w:pStyle w:val="Compact"/>
         <w:numPr>
           <w:ilvl w:val="0"/>
-          <w:numId w:val="1001"/>
+          <w:numId w:val="1004"/>
         </w:numPr>
       </w:pPr>
       <w:r>
@@ -305,16 +388,13 @@
       <w:r>
         <w:t xml:space="preserve">— Contributor and reviewer; drove adoption of lightweight API conventions.</w:t>
       </w:r>
-      <w:r>
-        <w:br/>
-      </w:r>
     </w:p>
     <w:p>
       <w:pPr>
         <w:pStyle w:val="Compact"/>
         <w:numPr>
           <w:ilvl w:val="0"/>
-          <w:numId w:val="1001"/>
+          <w:numId w:val="1004"/>
         </w:numPr>
       </w:pPr>
       <w:r>
@@ -550,6 +630,15 @@
     <w:abstractNumId w:val="990"/>
   </w:num>
   <w:num w:numId="1001">
+    <w:abstractNumId w:val="991"/>
+  </w:num>
+  <w:num w:numId="1002">
+    <w:abstractNumId w:val="991"/>
+  </w:num>
+  <w:num w:numId="1003">
+    <w:abstractNumId w:val="991"/>
+  </w:num>
+  <w:num w:numId="1004">
     <w:abstractNumId w:val="991"/>
   </w:num>
 </w:numbering>

</xml_diff>